<commit_message>
Registra al equipo y a la profesora en datos, caratula y desarrollos
</commit_message>
<xml_diff>
--- a/plantillas/Caratula.docx
+++ b/plantillas/Caratula.docx
@@ -105,7 +105,7 @@
             <v:path o:extrusionok="f" gradientshapeok="t" o:connecttype="rect"/>
             <o:lock v:ext="edit" aspectratio="t"/>
           </v:shapetype>
-          <v:shape id="Imagen 3" o:spid="_x0000_s1026" type="#_x0000_t75" alt="logo" style="position:absolute;margin-left:16.45pt;margin-top:-8.2pt;width:115.35pt;height:95.35pt;z-index:251657728;visibility:visible;mso-position-horizontal-relative:margin;mso-position-vertical-relative:margin">
+          <v:shape id="Imagen 3" o:spid="_x0000_s2050" type="#_x0000_t75" alt="logo" style="position:absolute;margin-left:16.45pt;margin-top:-8.2pt;width:115.35pt;height:95.35pt;z-index:251657728;visibility:visible;mso-position-horizontal-relative:margin;mso-position-vertical-relative:margin">
             <v:imagedata r:id="rId9" o:title="logo"/>
             <w10:wrap type="square" anchorx="margin" anchory="margin"/>
           </v:shape>
@@ -156,8 +156,6 @@
                 <w:lang w:val="es-MX" w:eastAsia="en-US"/>
               </w:rPr>
             </w:pPr>
-            <w:bookmarkStart w:id="0" w:name="_GoBack"/>
-            <w:bookmarkEnd w:id="0"/>
             <w:r>
               <w:rPr>
                 <w:color w:val="auto"/>
@@ -192,6 +190,126 @@
             <w:tcW w:w="7404" w:type="dxa"/>
             <w:tcBorders>
               <w:top w:val="nil"/>
+              <w:left w:val="nil"/>
+              <w:right w:val="nil"/>
+            </w:tcBorders>
+          </w:tcPr>
+          <w:p>
+            <w:pPr>
+              <w:spacing w:before="240" w:after="0" w:line="240" w:lineRule="auto"/>
+              <w:rPr>
+                <w:sz w:val="28"/>
+                <w:szCs w:val="28"/>
+              </w:rPr>
+            </w:pPr>
+            <w:r>
+              <w:rPr>
+                <w:sz w:val="28"/>
+                <w:szCs w:val="28"/>
+              </w:rPr>
+              <w:t>M. TECD. María Eugenia Bautista González</w:t>
+            </w:r>
+          </w:p>
+        </w:tc>
+      </w:tr>
+      <w:tr>
+        <w:tc>
+          <w:tcPr>
+            <w:tcW w:w="3227" w:type="dxa"/>
+            <w:tcBorders>
+              <w:top w:val="nil"/>
+              <w:left w:val="nil"/>
+              <w:bottom w:val="nil"/>
+              <w:right w:val="nil"/>
+            </w:tcBorders>
+          </w:tcPr>
+          <w:p>
+            <w:pPr>
+              <w:pStyle w:val="Subtitle"/>
+              <w:spacing w:before="240" w:after="0" w:line="240" w:lineRule="auto"/>
+              <w:jc w:val="right"/>
+              <w:rPr>
+                <w:color w:val="auto"/>
+                <w:sz w:val="30"/>
+                <w:szCs w:val="30"/>
+                <w:lang w:val="es-MX" w:eastAsia="en-US"/>
+              </w:rPr>
+            </w:pPr>
+            <w:r>
+              <w:rPr>
+                <w:color w:val="auto"/>
+                <w:sz w:val="30"/>
+                <w:szCs w:val="30"/>
+                <w:lang w:val="es-MX" w:eastAsia="es-MX"/>
+              </w:rPr>
+              <w:t>Asignatura:</w:t>
+            </w:r>
+          </w:p>
+        </w:tc>
+        <w:tc>
+          <w:tcPr>
+            <w:tcW w:w="7404" w:type="dxa"/>
+            <w:tcBorders>
+              <w:left w:val="nil"/>
+              <w:right w:val="nil"/>
+            </w:tcBorders>
+          </w:tcPr>
+          <w:p>
+            <w:pPr>
+              <w:spacing w:before="240" w:after="0" w:line="240" w:lineRule="auto"/>
+              <w:rPr>
+                <w:sz w:val="28"/>
+                <w:szCs w:val="28"/>
+              </w:rPr>
+            </w:pPr>
+            <w:r>
+              <w:rPr>
+                <w:sz w:val="28"/>
+                <w:szCs w:val="28"/>
+              </w:rPr>
+              <w:t>Lab. Redes de Datos Seguras</w:t>
+            </w:r>
+          </w:p>
+        </w:tc>
+      </w:tr>
+      <w:tr>
+        <w:tc>
+          <w:tcPr>
+            <w:tcW w:w="3227" w:type="dxa"/>
+            <w:tcBorders>
+              <w:top w:val="nil"/>
+              <w:left w:val="nil"/>
+              <w:bottom w:val="nil"/>
+              <w:right w:val="nil"/>
+            </w:tcBorders>
+          </w:tcPr>
+          <w:p>
+            <w:pPr>
+              <w:pStyle w:val="Subtitle"/>
+              <w:spacing w:before="240" w:after="0" w:line="240" w:lineRule="auto"/>
+              <w:jc w:val="right"/>
+              <w:rPr>
+                <w:color w:val="auto"/>
+                <w:sz w:val="30"/>
+                <w:szCs w:val="30"/>
+                <w:lang w:val="es-MX" w:eastAsia="en-US"/>
+              </w:rPr>
+            </w:pPr>
+            <w:r>
+              <w:rPr>
+                <w:color w:val="auto"/>
+                <w:sz w:val="30"/>
+                <w:szCs w:val="30"/>
+                <w:lang w:val="es-MX" w:eastAsia="es-MX"/>
+              </w:rPr>
+              <w:t>Grupo:</w:t>
+            </w:r>
+          </w:p>
+        </w:tc>
+        <w:tc>
+          <w:tcPr>
+            <w:tcW w:w="7404" w:type="dxa"/>
+            <w:tcBorders>
               <w:left w:val="nil"/>
               <w:right w:val="nil"/>
             </w:tcBorders>
@@ -237,7 +355,25 @@
                 <w:szCs w:val="30"/>
                 <w:lang w:val="es-MX" w:eastAsia="es-MX"/>
               </w:rPr>
-              <w:t>Asignatura:</w:t>
+              <w:t>No</w:t>
+            </w:r>
+            <w:r>
+              <w:rPr>
+                <w:color w:val="auto"/>
+                <w:sz w:val="30"/>
+                <w:szCs w:val="30"/>
+                <w:lang w:val="es-MX" w:eastAsia="es-MX"/>
+              </w:rPr>
+              <w:t>.</w:t>
+            </w:r>
+            <w:r>
+              <w:rPr>
+                <w:color w:val="auto"/>
+                <w:sz w:val="30"/>
+                <w:szCs w:val="30"/>
+                <w:lang w:val="es-MX" w:eastAsia="es-MX"/>
+              </w:rPr>
+              <w:t xml:space="preserve"> de Práctica(s):</w:t>
             </w:r>
           </w:p>
         </w:tc>
@@ -290,7 +426,7 @@
                 <w:szCs w:val="30"/>
                 <w:lang w:val="es-MX" w:eastAsia="es-MX"/>
               </w:rPr>
-              <w:t>Grupo:</w:t>
+              <w:t>Integrante(s):</w:t>
             </w:r>
           </w:p>
         </w:tc>
@@ -308,6 +444,113 @@
               <w:rPr>
                 <w:sz w:val="28"/>
                 <w:szCs w:val="28"/>
+              </w:rPr>
+            </w:pPr>
+            <w:r>
+              <w:rPr>
+                <w:sz w:val="28"/>
+                <w:szCs w:val="28"/>
+              </w:rPr>
+              <w:t>Jorge Salgado Miranda</w:t>
+            </w:r>
+          </w:p>
+        </w:tc>
+      </w:tr>
+      <w:tr>
+        <w:tc>
+          <w:tcPr>
+            <w:tcW w:w="3227" w:type="dxa"/>
+            <w:tcBorders>
+              <w:top w:val="nil"/>
+              <w:left w:val="nil"/>
+              <w:bottom w:val="nil"/>
+              <w:right w:val="nil"/>
+            </w:tcBorders>
+          </w:tcPr>
+          <w:p>
+            <w:pPr>
+              <w:pStyle w:val="Subtitle"/>
+              <w:spacing w:before="240" w:after="0" w:line="240" w:lineRule="auto"/>
+              <w:jc w:val="right"/>
+              <w:rPr>
+                <w:color w:val="auto"/>
+                <w:sz w:val="30"/>
+                <w:szCs w:val="30"/>
+                <w:lang w:val="es-MX" w:eastAsia="en-US"/>
+              </w:rPr>
+            </w:pPr>
+          </w:p>
+        </w:tc>
+        <w:tc>
+          <w:tcPr>
+            <w:tcW w:w="7404" w:type="dxa"/>
+            <w:tcBorders>
+              <w:left w:val="nil"/>
+              <w:right w:val="nil"/>
+            </w:tcBorders>
+          </w:tcPr>
+          <w:p>
+            <w:pPr>
+              <w:spacing w:before="240" w:after="0" w:line="240" w:lineRule="auto"/>
+              <w:rPr>
+                <w:sz w:val="28"/>
+                <w:szCs w:val="28"/>
+              </w:rPr>
+            </w:pPr>
+            <w:r>
+              <w:rPr>
+                <w:sz w:val="28"/>
+                <w:szCs w:val="28"/>
+              </w:rPr>
+              <w:t>Michelle Paola Gonzalez Martines</w:t>
+            </w:r>
+          </w:p>
+        </w:tc>
+      </w:tr>
+      <w:tr>
+        <w:tc>
+          <w:tcPr>
+            <w:tcW w:w="3227" w:type="dxa"/>
+            <w:tcBorders>
+              <w:top w:val="nil"/>
+              <w:left w:val="nil"/>
+              <w:bottom w:val="nil"/>
+              <w:right w:val="nil"/>
+            </w:tcBorders>
+          </w:tcPr>
+          <w:p>
+            <w:pPr>
+              <w:pStyle w:val="Subtitle"/>
+              <w:spacing w:before="240" w:after="0" w:line="240" w:lineRule="auto"/>
+              <w:jc w:val="right"/>
+              <w:rPr>
+                <w:color w:val="auto"/>
+                <w:sz w:val="30"/>
+                <w:szCs w:val="30"/>
+                <w:lang w:val="es-MX" w:eastAsia="es-MX"/>
+              </w:rPr>
+            </w:pPr>
+          </w:p>
+        </w:tc>
+        <w:tc>
+          <w:tcPr>
+            <w:tcW w:w="7404" w:type="dxa"/>
+            <w:tcBorders>
+              <w:left w:val="nil"/>
+              <w:bottom w:val="single" w:sz="4" w:space="0" w:color="auto"/>
+              <w:right w:val="nil"/>
+            </w:tcBorders>
+          </w:tcPr>
+          <w:p>
+            <w:pPr>
+              <w:pStyle w:val="Subtitle"/>
+              <w:spacing w:before="240" w:after="0" w:line="240" w:lineRule="auto"/>
+              <w:jc w:val="right"/>
+              <w:rPr>
+                <w:color w:val="auto"/>
+                <w:sz w:val="30"/>
+                <w:szCs w:val="30"/>
+                <w:lang w:val="es-MX" w:eastAsia="es-MX"/>
               </w:rPr>
             </w:pPr>
           </w:p>
@@ -333,7 +576,7 @@
                 <w:color w:val="auto"/>
                 <w:sz w:val="30"/>
                 <w:szCs w:val="30"/>
-                <w:lang w:val="es-MX" w:eastAsia="en-US"/>
+                <w:lang w:val="es-MX" w:eastAsia="es-MX"/>
               </w:rPr>
             </w:pPr>
             <w:r>
@@ -343,25 +586,7 @@
                 <w:szCs w:val="30"/>
                 <w:lang w:val="es-MX" w:eastAsia="es-MX"/>
               </w:rPr>
-              <w:t>No</w:t>
-            </w:r>
-            <w:r>
-              <w:rPr>
-                <w:color w:val="auto"/>
-                <w:sz w:val="30"/>
-                <w:szCs w:val="30"/>
-                <w:lang w:val="es-MX" w:eastAsia="es-MX"/>
-              </w:rPr>
-              <w:t>.</w:t>
-            </w:r>
-            <w:r>
-              <w:rPr>
-                <w:color w:val="auto"/>
-                <w:sz w:val="30"/>
-                <w:szCs w:val="30"/>
-                <w:lang w:val="es-MX" w:eastAsia="es-MX"/>
-              </w:rPr>
-              <w:t xml:space="preserve"> de Práctica(s):</w:t>
+              <w:t>No. de Equipo de cómputo empleado:</w:t>
             </w:r>
           </w:p>
         </w:tc>
@@ -369,16 +594,22 @@
           <w:tcPr>
             <w:tcW w:w="7404" w:type="dxa"/>
             <w:tcBorders>
+              <w:top w:val="single" w:sz="4" w:space="0" w:color="auto"/>
               <w:left w:val="nil"/>
+              <w:bottom w:val="single" w:sz="4" w:space="0" w:color="auto"/>
               <w:right w:val="nil"/>
             </w:tcBorders>
           </w:tcPr>
           <w:p>
             <w:pPr>
+              <w:pStyle w:val="Subtitle"/>
               <w:spacing w:before="240" w:after="0" w:line="240" w:lineRule="auto"/>
-              <w:rPr>
-                <w:sz w:val="28"/>
-                <w:szCs w:val="28"/>
+              <w:jc w:val="right"/>
+              <w:rPr>
+                <w:color w:val="auto"/>
+                <w:sz w:val="30"/>
+                <w:szCs w:val="30"/>
+                <w:lang w:val="es-MX" w:eastAsia="es-MX"/>
               </w:rPr>
             </w:pPr>
           </w:p>
@@ -404,211 +635,6 @@
                 <w:color w:val="auto"/>
                 <w:sz w:val="30"/>
                 <w:szCs w:val="30"/>
-                <w:lang w:val="es-MX" w:eastAsia="en-US"/>
-              </w:rPr>
-            </w:pPr>
-            <w:r>
-              <w:rPr>
-                <w:color w:val="auto"/>
-                <w:sz w:val="30"/>
-                <w:szCs w:val="30"/>
-                <w:lang w:val="es-MX" w:eastAsia="es-MX"/>
-              </w:rPr>
-              <w:t>Integrante(s):</w:t>
-            </w:r>
-          </w:p>
-        </w:tc>
-        <w:tc>
-          <w:tcPr>
-            <w:tcW w:w="7404" w:type="dxa"/>
-            <w:tcBorders>
-              <w:left w:val="nil"/>
-              <w:right w:val="nil"/>
-            </w:tcBorders>
-          </w:tcPr>
-          <w:p>
-            <w:pPr>
-              <w:spacing w:before="240" w:after="0" w:line="240" w:lineRule="auto"/>
-              <w:rPr>
-                <w:sz w:val="28"/>
-                <w:szCs w:val="28"/>
-              </w:rPr>
-            </w:pPr>
-          </w:p>
-        </w:tc>
-      </w:tr>
-      <w:tr>
-        <w:tc>
-          <w:tcPr>
-            <w:tcW w:w="3227" w:type="dxa"/>
-            <w:tcBorders>
-              <w:top w:val="nil"/>
-              <w:left w:val="nil"/>
-              <w:bottom w:val="nil"/>
-              <w:right w:val="nil"/>
-            </w:tcBorders>
-          </w:tcPr>
-          <w:p>
-            <w:pPr>
-              <w:pStyle w:val="Subtitle"/>
-              <w:spacing w:before="240" w:after="0" w:line="240" w:lineRule="auto"/>
-              <w:jc w:val="right"/>
-              <w:rPr>
-                <w:color w:val="auto"/>
-                <w:sz w:val="30"/>
-                <w:szCs w:val="30"/>
-                <w:lang w:val="es-MX" w:eastAsia="en-US"/>
-              </w:rPr>
-            </w:pPr>
-          </w:p>
-        </w:tc>
-        <w:tc>
-          <w:tcPr>
-            <w:tcW w:w="7404" w:type="dxa"/>
-            <w:tcBorders>
-              <w:left w:val="nil"/>
-              <w:right w:val="nil"/>
-            </w:tcBorders>
-          </w:tcPr>
-          <w:p>
-            <w:pPr>
-              <w:spacing w:before="240" w:after="0" w:line="240" w:lineRule="auto"/>
-              <w:rPr>
-                <w:sz w:val="28"/>
-                <w:szCs w:val="28"/>
-              </w:rPr>
-            </w:pPr>
-          </w:p>
-        </w:tc>
-      </w:tr>
-      <w:tr>
-        <w:tc>
-          <w:tcPr>
-            <w:tcW w:w="3227" w:type="dxa"/>
-            <w:tcBorders>
-              <w:top w:val="nil"/>
-              <w:left w:val="nil"/>
-              <w:bottom w:val="nil"/>
-              <w:right w:val="nil"/>
-            </w:tcBorders>
-          </w:tcPr>
-          <w:p>
-            <w:pPr>
-              <w:pStyle w:val="Subtitle"/>
-              <w:spacing w:before="240" w:after="0" w:line="240" w:lineRule="auto"/>
-              <w:jc w:val="right"/>
-              <w:rPr>
-                <w:color w:val="auto"/>
-                <w:sz w:val="30"/>
-                <w:szCs w:val="30"/>
-                <w:lang w:val="es-MX" w:eastAsia="es-MX"/>
-              </w:rPr>
-            </w:pPr>
-          </w:p>
-        </w:tc>
-        <w:tc>
-          <w:tcPr>
-            <w:tcW w:w="7404" w:type="dxa"/>
-            <w:tcBorders>
-              <w:left w:val="nil"/>
-              <w:bottom w:val="single" w:sz="4" w:space="0" w:color="auto"/>
-              <w:right w:val="nil"/>
-            </w:tcBorders>
-          </w:tcPr>
-          <w:p>
-            <w:pPr>
-              <w:pStyle w:val="Subtitle"/>
-              <w:spacing w:before="240" w:after="0" w:line="240" w:lineRule="auto"/>
-              <w:jc w:val="right"/>
-              <w:rPr>
-                <w:color w:val="auto"/>
-                <w:sz w:val="30"/>
-                <w:szCs w:val="30"/>
-                <w:lang w:val="es-MX" w:eastAsia="es-MX"/>
-              </w:rPr>
-            </w:pPr>
-          </w:p>
-        </w:tc>
-      </w:tr>
-      <w:tr>
-        <w:tc>
-          <w:tcPr>
-            <w:tcW w:w="3227" w:type="dxa"/>
-            <w:tcBorders>
-              <w:top w:val="nil"/>
-              <w:left w:val="nil"/>
-              <w:bottom w:val="nil"/>
-              <w:right w:val="nil"/>
-            </w:tcBorders>
-          </w:tcPr>
-          <w:p>
-            <w:pPr>
-              <w:pStyle w:val="Subtitle"/>
-              <w:spacing w:before="240" w:after="0" w:line="240" w:lineRule="auto"/>
-              <w:jc w:val="right"/>
-              <w:rPr>
-                <w:color w:val="auto"/>
-                <w:sz w:val="30"/>
-                <w:szCs w:val="30"/>
-                <w:lang w:val="es-MX" w:eastAsia="es-MX"/>
-              </w:rPr>
-            </w:pPr>
-            <w:r>
-              <w:rPr>
-                <w:color w:val="auto"/>
-                <w:sz w:val="30"/>
-                <w:szCs w:val="30"/>
-                <w:lang w:val="es-MX" w:eastAsia="es-MX"/>
-              </w:rPr>
-              <w:t>No. de Equipo de cómputo empleado:</w:t>
-            </w:r>
-          </w:p>
-        </w:tc>
-        <w:tc>
-          <w:tcPr>
-            <w:tcW w:w="7404" w:type="dxa"/>
-            <w:tcBorders>
-              <w:top w:val="single" w:sz="4" w:space="0" w:color="auto"/>
-              <w:left w:val="nil"/>
-              <w:bottom w:val="single" w:sz="4" w:space="0" w:color="auto"/>
-              <w:right w:val="nil"/>
-            </w:tcBorders>
-          </w:tcPr>
-          <w:p>
-            <w:pPr>
-              <w:pStyle w:val="Subtitle"/>
-              <w:spacing w:before="240" w:after="0" w:line="240" w:lineRule="auto"/>
-              <w:jc w:val="right"/>
-              <w:rPr>
-                <w:color w:val="auto"/>
-                <w:sz w:val="30"/>
-                <w:szCs w:val="30"/>
-                <w:lang w:val="es-MX" w:eastAsia="es-MX"/>
-              </w:rPr>
-            </w:pPr>
-          </w:p>
-        </w:tc>
-      </w:tr>
-      <w:tr>
-        <w:tc>
-          <w:tcPr>
-            <w:tcW w:w="3227" w:type="dxa"/>
-            <w:tcBorders>
-              <w:top w:val="nil"/>
-              <w:left w:val="nil"/>
-              <w:bottom w:val="nil"/>
-              <w:right w:val="nil"/>
-            </w:tcBorders>
-          </w:tcPr>
-          <w:p>
-            <w:pPr>
-              <w:pStyle w:val="Subtitle"/>
-              <w:spacing w:before="240" w:after="0" w:line="240" w:lineRule="auto"/>
-              <w:jc w:val="right"/>
-              <w:rPr>
-                <w:color w:val="auto"/>
-                <w:sz w:val="30"/>
-                <w:szCs w:val="30"/>
                 <w:lang w:val="es-MX" w:eastAsia="es-MX"/>
               </w:rPr>
             </w:pPr>
@@ -645,6 +671,15 @@
                 <w:lang w:val="es-MX" w:eastAsia="es-MX"/>
               </w:rPr>
             </w:pPr>
+            <w:r>
+              <w:rPr>
+                <w:color w:val="auto"/>
+                <w:sz w:val="30"/>
+                <w:szCs w:val="30"/>
+                <w:lang w:val="es-MX" w:eastAsia="es-MX"/>
+              </w:rPr>
+              <w:t>2027-1</w:t>
+            </w:r>
           </w:p>
         </w:tc>
       </w:tr>
@@ -2155,7 +2190,6 @@
     <w:uiPriority w:val="99"/>
     <w:semiHidden/>
     <w:unhideWhenUsed/>
-    <w:qFormat/>
     <w:tblPr>
       <w:tblInd w:w="0" w:type="dxa"/>
       <w:tblCellMar>

</xml_diff>

<commit_message>
Guarda reglas de sala del lab de redes y previos de la practica 1.
Evaluacion 60/10/30, Forms 17:00 a 17:15, llegada, caratula, PDF Practica xx-SalgadoyGonzalez y rotacion practicante-escribano. Incluye el reglamento de sala y la actividad 1 de teoria.
</commit_message>
<xml_diff>
--- a/plantillas/Caratula.docx
+++ b/plantillas/Caratula.docx
@@ -1,6 +1,6 @@
 
 <file path=word/document.xml><?xml version="1.0" encoding="utf-8"?>
-<w:document xmlns:wpc="http://schemas.microsoft.com/office/word/2010/wordprocessingCanvas" xmlns:cx="http://schemas.microsoft.com/office/drawing/2014/chartex" xmlns:cx1="http://schemas.microsoft.com/office/drawing/2015/9/8/chartex" xmlns:cx2="http://schemas.microsoft.com/office/drawing/2015/10/21/chartex" xmlns:cx3="http://schemas.microsoft.com/office/drawing/2016/5/9/chartex" xmlns:cx4="http://schemas.microsoft.com/office/drawing/2016/5/10/chartex" xmlns:cx5="http://schemas.microsoft.com/office/drawing/2016/5/11/chartex" xmlns:cx6="http://schemas.microsoft.com/office/drawing/2016/5/12/chartex" xmlns:cx7="http://schemas.microsoft.com/office/drawing/2016/5/13/chartex" xmlns:cx8="http://schemas.microsoft.com/office/drawing/2016/5/14/chartex" xmlns:mc="http://schemas.openxmlformats.org/markup-compatibility/2006" xmlns:aink="http://schemas.microsoft.com/office/drawing/2016/ink" xmlns:am3d="http://schemas.microsoft.com/office/drawing/2017/model3d" xmlns:o="urn:schemas-microsoft-com:office:office" xmlns:oel="http://schemas.microsoft.com/office/2019/extlst" xmlns:r="http://schemas.openxmlformats.org/officeDocument/2006/relationships" xmlns:m="http://schemas.openxmlformats.org/officeDocument/2006/math" xmlns:v="urn:schemas-microsoft-com:vml" xmlns:wp14="http://schemas.microsoft.com/office/word/2010/wordprocessingDrawing" xmlns:wp="http://schemas.openxmlformats.org/drawingml/2006/wordprocessingDrawing" xmlns:w10="urn:schemas-microsoft-com:office:word" xmlns:w="http://schemas.openxmlformats.org/wordprocessingml/2006/main" xmlns:w14="http://schemas.microsoft.com/office/word/2010/wordml" xmlns:w15="http://schemas.microsoft.com/office/word/2012/wordml" xmlns:w16cei="http://schemas.microsoft.com/office/word/2026/wordml/cei" xmlns:w16cex="http://schemas.microsoft.com/office/word/2018/wordml/cex" xmlns:w16cid="http://schemas.microsoft.com/office/word/2016/wordml/cid" xmlns:w16="http://schemas.microsoft.com/office/word/2018/wordml" xmlns:w16du="http://schemas.microsoft.com/office/word/2023/wordml/word16du" xmlns:w16sdtdh="http://schemas.microsoft.com/office/word/2020/wordml/sdtdatahash" xmlns:w16sdtfl="http://schemas.microsoft.com/office/word/2024/wordml/sdtformatlock" xmlns:w16se="http://schemas.microsoft.com/office/word/2015/wordml/symex" xmlns:wpg="http://schemas.microsoft.com/office/word/2010/wordprocessingGroup" xmlns:wpi="http://schemas.microsoft.com/office/word/2010/wordprocessingInk" xmlns:wne="http://schemas.microsoft.com/office/word/2006/wordml" xmlns:wps="http://schemas.microsoft.com/office/word/2010/wordprocessingShape" mc:Ignorable="w14 w15 w16se w16cid w16 w16cex w16sdtdh w16sdtfl w16du wp14">
+<w:document xmlns:wpc="http://schemas.microsoft.com/office/word/2010/wordprocessingCanvas" xmlns:cx="http://schemas.microsoft.com/office/drawing/2014/chartex" xmlns:cx1="http://schemas.microsoft.com/office/drawing/2015/9/8/chartex" xmlns:cx2="http://schemas.microsoft.com/office/drawing/2015/10/21/chartex" xmlns:cx3="http://schemas.microsoft.com/office/drawing/2016/5/9/chartex" xmlns:cx4="http://schemas.microsoft.com/office/drawing/2016/5/10/chartex" xmlns:cx5="http://schemas.microsoft.com/office/drawing/2016/5/11/chartex" xmlns:cx6="http://schemas.microsoft.com/office/drawing/2016/5/12/chartex" xmlns:cx7="http://schemas.microsoft.com/office/drawing/2016/5/13/chartex" xmlns:cx8="http://schemas.microsoft.com/office/drawing/2016/5/14/chartex" xmlns:mc="http://schemas.openxmlformats.org/markup-compatibility/2006" xmlns:aink="http://schemas.microsoft.com/office/drawing/2016/ink" xmlns:am3d="http://schemas.microsoft.com/office/drawing/2017/model3d" xmlns:o="urn:schemas-microsoft-com:office:office" xmlns:oel="http://schemas.microsoft.com/office/2019/extlst" xmlns:r="http://schemas.openxmlformats.org/officeDocument/2006/relationships" xmlns:m="http://schemas.openxmlformats.org/officeDocument/2006/math" xmlns:v="urn:schemas-microsoft-com:vml" xmlns:wp14="http://schemas.microsoft.com/office/word/2010/wordprocessingDrawing" xmlns:wp="http://schemas.openxmlformats.org/drawingml/2006/wordprocessingDrawing" xmlns:w10="urn:schemas-microsoft-com:office:word" xmlns:w="http://schemas.openxmlformats.org/wordprocessingml/2006/main" xmlns:w14="http://schemas.microsoft.com/office/word/2010/wordml" xmlns:w15="http://schemas.microsoft.com/office/word/2012/wordml" xmlns:w16cex="http://schemas.microsoft.com/office/word/2018/wordml/cex" xmlns:w16cid="http://schemas.microsoft.com/office/word/2016/wordml/cid" xmlns:w16="http://schemas.microsoft.com/office/word/2018/wordml" xmlns:w16du="http://schemas.microsoft.com/office/word/2023/wordml/word16du" xmlns:w16sdtdh="http://schemas.microsoft.com/office/word/2020/wordml/sdtdatahash" xmlns:w16sdtfl="http://schemas.microsoft.com/office/word/2024/wordml/sdtformatlock" xmlns:w16se="http://schemas.microsoft.com/office/word/2015/wordml/symex" xmlns:wpg="http://schemas.microsoft.com/office/word/2010/wordprocessingGroup" xmlns:wpi="http://schemas.microsoft.com/office/word/2010/wordprocessingInk" xmlns:wne="http://schemas.microsoft.com/office/word/2006/wordml" xmlns:wps="http://schemas.microsoft.com/office/word/2010/wordprocessingShape" mc:Ignorable="w14 w15 w16se w16cid w16 w16cex w16sdtdh w16sdtfl w16du wp14">
   <w:body>
     <w:tbl>
       <w:tblPr>
@@ -207,7 +207,7 @@
                 <w:sz w:val="28"/>
                 <w:szCs w:val="28"/>
               </w:rPr>
-              <w:t>M. TECD. María Eugenia Bautista González</w:t>
+              <w:t>Maestra María Eugenia Bautista González</w:t>
             </w:r>
           </w:p>
         </w:tc>
@@ -267,7 +267,7 @@
                 <w:sz w:val="28"/>
                 <w:szCs w:val="28"/>
               </w:rPr>
-              <w:t>Lab. Redes de Datos Seguras</w:t>
+              <w:t>Laboratorio de Redes de Datos Seguras</w:t>
             </w:r>
           </w:p>
         </w:tc>
@@ -1035,7 +1035,7 @@
 </file>
 
 <file path=word/endnotes.xml><?xml version="1.0" encoding="utf-8"?>
-<w:endnotes xmlns:wpc="http://schemas.microsoft.com/office/word/2010/wordprocessingCanvas" xmlns:cx="http://schemas.microsoft.com/office/drawing/2014/chartex" xmlns:cx1="http://schemas.microsoft.com/office/drawing/2015/9/8/chartex" xmlns:cx2="http://schemas.microsoft.com/office/drawing/2015/10/21/chartex" xmlns:cx3="http://schemas.microsoft.com/office/drawing/2016/5/9/chartex" xmlns:cx4="http://schemas.microsoft.com/office/drawing/2016/5/10/chartex" xmlns:cx5="http://schemas.microsoft.com/office/drawing/2016/5/11/chartex" xmlns:cx6="http://schemas.microsoft.com/office/drawing/2016/5/12/chartex" xmlns:cx7="http://schemas.microsoft.com/office/drawing/2016/5/13/chartex" xmlns:cx8="http://schemas.microsoft.com/office/drawing/2016/5/14/chartex" xmlns:mc="http://schemas.openxmlformats.org/markup-compatibility/2006" xmlns:aink="http://schemas.microsoft.com/office/drawing/2016/ink" xmlns:am3d="http://schemas.microsoft.com/office/drawing/2017/model3d" xmlns:o="urn:schemas-microsoft-com:office:office" xmlns:oel="http://schemas.microsoft.com/office/2019/extlst" xmlns:r="http://schemas.openxmlformats.org/officeDocument/2006/relationships" xmlns:m="http://schemas.openxmlformats.org/officeDocument/2006/math" xmlns:v="urn:schemas-microsoft-com:vml" xmlns:wp14="http://schemas.microsoft.com/office/word/2010/wordprocessingDrawing" xmlns:wp="http://schemas.openxmlformats.org/drawingml/2006/wordprocessingDrawing" xmlns:w10="urn:schemas-microsoft-com:office:word" xmlns:w="http://schemas.openxmlformats.org/wordprocessingml/2006/main" xmlns:w14="http://schemas.microsoft.com/office/word/2010/wordml" xmlns:w15="http://schemas.microsoft.com/office/word/2012/wordml" xmlns:w16cei="http://schemas.microsoft.com/office/word/2026/wordml/cei" xmlns:w16cex="http://schemas.microsoft.com/office/word/2018/wordml/cex" xmlns:w16cid="http://schemas.microsoft.com/office/word/2016/wordml/cid" xmlns:w16="http://schemas.microsoft.com/office/word/2018/wordml" xmlns:w16du="http://schemas.microsoft.com/office/word/2023/wordml/word16du" xmlns:w16sdtdh="http://schemas.microsoft.com/office/word/2020/wordml/sdtdatahash" xmlns:w16sdtfl="http://schemas.microsoft.com/office/word/2024/wordml/sdtformatlock" xmlns:w16se="http://schemas.microsoft.com/office/word/2015/wordml/symex" xmlns:wpg="http://schemas.microsoft.com/office/word/2010/wordprocessingGroup" xmlns:wpi="http://schemas.microsoft.com/office/word/2010/wordprocessingInk" xmlns:wne="http://schemas.microsoft.com/office/word/2006/wordml" xmlns:wps="http://schemas.microsoft.com/office/word/2010/wordprocessingShape" mc:Ignorable="w14 w15 w16se w16cid w16 w16cex w16sdtdh w16sdtfl w16du wp14">
+<w:endnotes xmlns:wpc="http://schemas.microsoft.com/office/word/2010/wordprocessingCanvas" xmlns:cx="http://schemas.microsoft.com/office/drawing/2014/chartex" xmlns:cx1="http://schemas.microsoft.com/office/drawing/2015/9/8/chartex" xmlns:cx2="http://schemas.microsoft.com/office/drawing/2015/10/21/chartex" xmlns:cx3="http://schemas.microsoft.com/office/drawing/2016/5/9/chartex" xmlns:cx4="http://schemas.microsoft.com/office/drawing/2016/5/10/chartex" xmlns:cx5="http://schemas.microsoft.com/office/drawing/2016/5/11/chartex" xmlns:cx6="http://schemas.microsoft.com/office/drawing/2016/5/12/chartex" xmlns:cx7="http://schemas.microsoft.com/office/drawing/2016/5/13/chartex" xmlns:cx8="http://schemas.microsoft.com/office/drawing/2016/5/14/chartex" xmlns:mc="http://schemas.openxmlformats.org/markup-compatibility/2006" xmlns:aink="http://schemas.microsoft.com/office/drawing/2016/ink" xmlns:am3d="http://schemas.microsoft.com/office/drawing/2017/model3d" xmlns:o="urn:schemas-microsoft-com:office:office" xmlns:oel="http://schemas.microsoft.com/office/2019/extlst" xmlns:r="http://schemas.openxmlformats.org/officeDocument/2006/relationships" xmlns:m="http://schemas.openxmlformats.org/officeDocument/2006/math" xmlns:v="urn:schemas-microsoft-com:vml" xmlns:wp14="http://schemas.microsoft.com/office/word/2010/wordprocessingDrawing" xmlns:wp="http://schemas.openxmlformats.org/drawingml/2006/wordprocessingDrawing" xmlns:w10="urn:schemas-microsoft-com:office:word" xmlns:w="http://schemas.openxmlformats.org/wordprocessingml/2006/main" xmlns:w14="http://schemas.microsoft.com/office/word/2010/wordml" xmlns:w15="http://schemas.microsoft.com/office/word/2012/wordml" xmlns:w16cex="http://schemas.microsoft.com/office/word/2018/wordml/cex" xmlns:w16cid="http://schemas.microsoft.com/office/word/2016/wordml/cid" xmlns:w16="http://schemas.microsoft.com/office/word/2018/wordml" xmlns:w16du="http://schemas.microsoft.com/office/word/2023/wordml/word16du" xmlns:w16sdtdh="http://schemas.microsoft.com/office/word/2020/wordml/sdtdatahash" xmlns:w16sdtfl="http://schemas.microsoft.com/office/word/2024/wordml/sdtformatlock" xmlns:w16se="http://schemas.microsoft.com/office/word/2015/wordml/symex" xmlns:wpg="http://schemas.microsoft.com/office/word/2010/wordprocessingGroup" xmlns:wpi="http://schemas.microsoft.com/office/word/2010/wordprocessingInk" xmlns:wne="http://schemas.microsoft.com/office/word/2006/wordml" xmlns:wps="http://schemas.microsoft.com/office/word/2010/wordprocessingShape" mc:Ignorable="w14 w15 w16se w16cid w16 w16cex w16sdtdh w16sdtfl w16du wp14">
   <w:endnote w:type="separator" w:id="-1">
     <w:p>
       <w:pPr>
@@ -1060,7 +1060,7 @@
 </file>
 
 <file path=word/footer1.xml><?xml version="1.0" encoding="utf-8"?>
-<w:ftr xmlns:wpc="http://schemas.microsoft.com/office/word/2010/wordprocessingCanvas" xmlns:cx="http://schemas.microsoft.com/office/drawing/2014/chartex" xmlns:cx1="http://schemas.microsoft.com/office/drawing/2015/9/8/chartex" xmlns:cx2="http://schemas.microsoft.com/office/drawing/2015/10/21/chartex" xmlns:cx3="http://schemas.microsoft.com/office/drawing/2016/5/9/chartex" xmlns:cx4="http://schemas.microsoft.com/office/drawing/2016/5/10/chartex" xmlns:cx5="http://schemas.microsoft.com/office/drawing/2016/5/11/chartex" xmlns:cx6="http://schemas.microsoft.com/office/drawing/2016/5/12/chartex" xmlns:cx7="http://schemas.microsoft.com/office/drawing/2016/5/13/chartex" xmlns:cx8="http://schemas.microsoft.com/office/drawing/2016/5/14/chartex" xmlns:mc="http://schemas.openxmlformats.org/markup-compatibility/2006" xmlns:aink="http://schemas.microsoft.com/office/drawing/2016/ink" xmlns:am3d="http://schemas.microsoft.com/office/drawing/2017/model3d" xmlns:o="urn:schemas-microsoft-com:office:office" xmlns:oel="http://schemas.microsoft.com/office/2019/extlst" xmlns:r="http://schemas.openxmlformats.org/officeDocument/2006/relationships" xmlns:m="http://schemas.openxmlformats.org/officeDocument/2006/math" xmlns:v="urn:schemas-microsoft-com:vml" xmlns:wp14="http://schemas.microsoft.com/office/word/2010/wordprocessingDrawing" xmlns:wp="http://schemas.openxmlformats.org/drawingml/2006/wordprocessingDrawing" xmlns:w10="urn:schemas-microsoft-com:office:word" xmlns:w="http://schemas.openxmlformats.org/wordprocessingml/2006/main" xmlns:w14="http://schemas.microsoft.com/office/word/2010/wordml" xmlns:w15="http://schemas.microsoft.com/office/word/2012/wordml" xmlns:w16cei="http://schemas.microsoft.com/office/word/2026/wordml/cei" xmlns:w16cex="http://schemas.microsoft.com/office/word/2018/wordml/cex" xmlns:w16cid="http://schemas.microsoft.com/office/word/2016/wordml/cid" xmlns:w16="http://schemas.microsoft.com/office/word/2018/wordml" xmlns:w16du="http://schemas.microsoft.com/office/word/2023/wordml/word16du" xmlns:w16sdtdh="http://schemas.microsoft.com/office/word/2020/wordml/sdtdatahash" xmlns:w16sdtfl="http://schemas.microsoft.com/office/word/2024/wordml/sdtformatlock" xmlns:w16se="http://schemas.microsoft.com/office/word/2015/wordml/symex" xmlns:wpg="http://schemas.microsoft.com/office/word/2010/wordprocessingGroup" xmlns:wpi="http://schemas.microsoft.com/office/word/2010/wordprocessingInk" xmlns:wne="http://schemas.microsoft.com/office/word/2006/wordml" xmlns:wps="http://schemas.microsoft.com/office/word/2010/wordprocessingShape" mc:Ignorable="w14 w15 w16se w16cid w16 w16cex w16sdtdh w16sdtfl w16du wp14">
+<w:ftr xmlns:wpc="http://schemas.microsoft.com/office/word/2010/wordprocessingCanvas" xmlns:cx="http://schemas.microsoft.com/office/drawing/2014/chartex" xmlns:cx1="http://schemas.microsoft.com/office/drawing/2015/9/8/chartex" xmlns:cx2="http://schemas.microsoft.com/office/drawing/2015/10/21/chartex" xmlns:cx3="http://schemas.microsoft.com/office/drawing/2016/5/9/chartex" xmlns:cx4="http://schemas.microsoft.com/office/drawing/2016/5/10/chartex" xmlns:cx5="http://schemas.microsoft.com/office/drawing/2016/5/11/chartex" xmlns:cx6="http://schemas.microsoft.com/office/drawing/2016/5/12/chartex" xmlns:cx7="http://schemas.microsoft.com/office/drawing/2016/5/13/chartex" xmlns:cx8="http://schemas.microsoft.com/office/drawing/2016/5/14/chartex" xmlns:mc="http://schemas.openxmlformats.org/markup-compatibility/2006" xmlns:aink="http://schemas.microsoft.com/office/drawing/2016/ink" xmlns:am3d="http://schemas.microsoft.com/office/drawing/2017/model3d" xmlns:o="urn:schemas-microsoft-com:office:office" xmlns:oel="http://schemas.microsoft.com/office/2019/extlst" xmlns:r="http://schemas.openxmlformats.org/officeDocument/2006/relationships" xmlns:m="http://schemas.openxmlformats.org/officeDocument/2006/math" xmlns:v="urn:schemas-microsoft-com:vml" xmlns:wp14="http://schemas.microsoft.com/office/word/2010/wordprocessingDrawing" xmlns:wp="http://schemas.openxmlformats.org/drawingml/2006/wordprocessingDrawing" xmlns:w10="urn:schemas-microsoft-com:office:word" xmlns:w="http://schemas.openxmlformats.org/wordprocessingml/2006/main" xmlns:w14="http://schemas.microsoft.com/office/word/2010/wordml" xmlns:w15="http://schemas.microsoft.com/office/word/2012/wordml" xmlns:w16cex="http://schemas.microsoft.com/office/word/2018/wordml/cex" xmlns:w16cid="http://schemas.microsoft.com/office/word/2016/wordml/cid" xmlns:w16="http://schemas.microsoft.com/office/word/2018/wordml" xmlns:w16du="http://schemas.microsoft.com/office/word/2023/wordml/word16du" xmlns:w16sdtdh="http://schemas.microsoft.com/office/word/2020/wordml/sdtdatahash" xmlns:w16sdtfl="http://schemas.microsoft.com/office/word/2024/wordml/sdtformatlock" xmlns:w16se="http://schemas.microsoft.com/office/word/2015/wordml/symex" xmlns:wpg="http://schemas.microsoft.com/office/word/2010/wordprocessingGroup" xmlns:wpi="http://schemas.microsoft.com/office/word/2010/wordprocessingInk" xmlns:wne="http://schemas.microsoft.com/office/word/2006/wordml" xmlns:wps="http://schemas.microsoft.com/office/word/2010/wordprocessingShape" mc:Ignorable="w14 w15 w16se w16cid w16 w16cex w16sdtdh w16sdtfl w16du wp14">
   <w:p>
     <w:pPr>
       <w:pStyle w:val="Footer"/>
@@ -1070,7 +1070,7 @@
 </file>
 
 <file path=word/footer2.xml><?xml version="1.0" encoding="utf-8"?>
-<w:ftr xmlns:wpc="http://schemas.microsoft.com/office/word/2010/wordprocessingCanvas" xmlns:cx="http://schemas.microsoft.com/office/drawing/2014/chartex" xmlns:cx1="http://schemas.microsoft.com/office/drawing/2015/9/8/chartex" xmlns:cx2="http://schemas.microsoft.com/office/drawing/2015/10/21/chartex" xmlns:cx3="http://schemas.microsoft.com/office/drawing/2016/5/9/chartex" xmlns:cx4="http://schemas.microsoft.com/office/drawing/2016/5/10/chartex" xmlns:cx5="http://schemas.microsoft.com/office/drawing/2016/5/11/chartex" xmlns:cx6="http://schemas.microsoft.com/office/drawing/2016/5/12/chartex" xmlns:cx7="http://schemas.microsoft.com/office/drawing/2016/5/13/chartex" xmlns:cx8="http://schemas.microsoft.com/office/drawing/2016/5/14/chartex" xmlns:mc="http://schemas.openxmlformats.org/markup-compatibility/2006" xmlns:aink="http://schemas.microsoft.com/office/drawing/2016/ink" xmlns:am3d="http://schemas.microsoft.com/office/drawing/2017/model3d" xmlns:o="urn:schemas-microsoft-com:office:office" xmlns:oel="http://schemas.microsoft.com/office/2019/extlst" xmlns:r="http://schemas.openxmlformats.org/officeDocument/2006/relationships" xmlns:m="http://schemas.openxmlformats.org/officeDocument/2006/math" xmlns:v="urn:schemas-microsoft-com:vml" xmlns:wp14="http://schemas.microsoft.com/office/word/2010/wordprocessingDrawing" xmlns:wp="http://schemas.openxmlformats.org/drawingml/2006/wordprocessingDrawing" xmlns:w10="urn:schemas-microsoft-com:office:word" xmlns:w="http://schemas.openxmlformats.org/wordprocessingml/2006/main" xmlns:w14="http://schemas.microsoft.com/office/word/2010/wordml" xmlns:w15="http://schemas.microsoft.com/office/word/2012/wordml" xmlns:w16cei="http://schemas.microsoft.com/office/word/2026/wordml/cei" xmlns:w16cex="http://schemas.microsoft.com/office/word/2018/wordml/cex" xmlns:w16cid="http://schemas.microsoft.com/office/word/2016/wordml/cid" xmlns:w16="http://schemas.microsoft.com/office/word/2018/wordml" xmlns:w16du="http://schemas.microsoft.com/office/word/2023/wordml/word16du" xmlns:w16sdtdh="http://schemas.microsoft.com/office/word/2020/wordml/sdtdatahash" xmlns:w16sdtfl="http://schemas.microsoft.com/office/word/2024/wordml/sdtformatlock" xmlns:w16se="http://schemas.microsoft.com/office/word/2015/wordml/symex" xmlns:wpg="http://schemas.microsoft.com/office/word/2010/wordprocessingGroup" xmlns:wpi="http://schemas.microsoft.com/office/word/2010/wordprocessingInk" xmlns:wne="http://schemas.microsoft.com/office/word/2006/wordml" xmlns:wps="http://schemas.microsoft.com/office/word/2010/wordprocessingShape" mc:Ignorable="w14 w15 w16se w16cid w16 w16cex w16sdtdh w16sdtfl w16du wp14">
+<w:ftr xmlns:wpc="http://schemas.microsoft.com/office/word/2010/wordprocessingCanvas" xmlns:cx="http://schemas.microsoft.com/office/drawing/2014/chartex" xmlns:cx1="http://schemas.microsoft.com/office/drawing/2015/9/8/chartex" xmlns:cx2="http://schemas.microsoft.com/office/drawing/2015/10/21/chartex" xmlns:cx3="http://schemas.microsoft.com/office/drawing/2016/5/9/chartex" xmlns:cx4="http://schemas.microsoft.com/office/drawing/2016/5/10/chartex" xmlns:cx5="http://schemas.microsoft.com/office/drawing/2016/5/11/chartex" xmlns:cx6="http://schemas.microsoft.com/office/drawing/2016/5/12/chartex" xmlns:cx7="http://schemas.microsoft.com/office/drawing/2016/5/13/chartex" xmlns:cx8="http://schemas.microsoft.com/office/drawing/2016/5/14/chartex" xmlns:mc="http://schemas.openxmlformats.org/markup-compatibility/2006" xmlns:aink="http://schemas.microsoft.com/office/drawing/2016/ink" xmlns:am3d="http://schemas.microsoft.com/office/drawing/2017/model3d" xmlns:o="urn:schemas-microsoft-com:office:office" xmlns:oel="http://schemas.microsoft.com/office/2019/extlst" xmlns:r="http://schemas.openxmlformats.org/officeDocument/2006/relationships" xmlns:m="http://schemas.openxmlformats.org/officeDocument/2006/math" xmlns:v="urn:schemas-microsoft-com:vml" xmlns:wp14="http://schemas.microsoft.com/office/word/2010/wordprocessingDrawing" xmlns:wp="http://schemas.openxmlformats.org/drawingml/2006/wordprocessingDrawing" xmlns:w10="urn:schemas-microsoft-com:office:word" xmlns:w="http://schemas.openxmlformats.org/wordprocessingml/2006/main" xmlns:w14="http://schemas.microsoft.com/office/word/2010/wordml" xmlns:w15="http://schemas.microsoft.com/office/word/2012/wordml" xmlns:w16cex="http://schemas.microsoft.com/office/word/2018/wordml/cex" xmlns:w16cid="http://schemas.microsoft.com/office/word/2016/wordml/cid" xmlns:w16="http://schemas.microsoft.com/office/word/2018/wordml" xmlns:w16du="http://schemas.microsoft.com/office/word/2023/wordml/word16du" xmlns:w16sdtdh="http://schemas.microsoft.com/office/word/2020/wordml/sdtdatahash" xmlns:w16sdtfl="http://schemas.microsoft.com/office/word/2024/wordml/sdtformatlock" xmlns:w16se="http://schemas.microsoft.com/office/word/2015/wordml/symex" xmlns:wpg="http://schemas.microsoft.com/office/word/2010/wordprocessingGroup" xmlns:wpi="http://schemas.microsoft.com/office/word/2010/wordprocessingInk" xmlns:wne="http://schemas.microsoft.com/office/word/2006/wordml" xmlns:wps="http://schemas.microsoft.com/office/word/2010/wordprocessingShape" mc:Ignorable="w14 w15 w16se w16cid w16 w16cex w16sdtdh w16sdtfl w16du wp14">
   <w:p>
     <w:pPr>
       <w:pStyle w:val="Footer"/>
@@ -1080,7 +1080,7 @@
 </file>
 
 <file path=word/footer3.xml><?xml version="1.0" encoding="utf-8"?>
-<w:ftr xmlns:wpc="http://schemas.microsoft.com/office/word/2010/wordprocessingCanvas" xmlns:cx="http://schemas.microsoft.com/office/drawing/2014/chartex" xmlns:cx1="http://schemas.microsoft.com/office/drawing/2015/9/8/chartex" xmlns:cx2="http://schemas.microsoft.com/office/drawing/2015/10/21/chartex" xmlns:cx3="http://schemas.microsoft.com/office/drawing/2016/5/9/chartex" xmlns:cx4="http://schemas.microsoft.com/office/drawing/2016/5/10/chartex" xmlns:cx5="http://schemas.microsoft.com/office/drawing/2016/5/11/chartex" xmlns:cx6="http://schemas.microsoft.com/office/drawing/2016/5/12/chartex" xmlns:cx7="http://schemas.microsoft.com/office/drawing/2016/5/13/chartex" xmlns:cx8="http://schemas.microsoft.com/office/drawing/2016/5/14/chartex" xmlns:mc="http://schemas.openxmlformats.org/markup-compatibility/2006" xmlns:aink="http://schemas.microsoft.com/office/drawing/2016/ink" xmlns:am3d="http://schemas.microsoft.com/office/drawing/2017/model3d" xmlns:o="urn:schemas-microsoft-com:office:office" xmlns:oel="http://schemas.microsoft.com/office/2019/extlst" xmlns:r="http://schemas.openxmlformats.org/officeDocument/2006/relationships" xmlns:m="http://schemas.openxmlformats.org/officeDocument/2006/math" xmlns:v="urn:schemas-microsoft-com:vml" xmlns:wp14="http://schemas.microsoft.com/office/word/2010/wordprocessingDrawing" xmlns:wp="http://schemas.openxmlformats.org/drawingml/2006/wordprocessingDrawing" xmlns:w10="urn:schemas-microsoft-com:office:word" xmlns:w="http://schemas.openxmlformats.org/wordprocessingml/2006/main" xmlns:w14="http://schemas.microsoft.com/office/word/2010/wordml" xmlns:w15="http://schemas.microsoft.com/office/word/2012/wordml" xmlns:w16cei="http://schemas.microsoft.com/office/word/2026/wordml/cei" xmlns:w16cex="http://schemas.microsoft.com/office/word/2018/wordml/cex" xmlns:w16cid="http://schemas.microsoft.com/office/word/2016/wordml/cid" xmlns:w16="http://schemas.microsoft.com/office/word/2018/wordml" xmlns:w16du="http://schemas.microsoft.com/office/word/2023/wordml/word16du" xmlns:w16sdtdh="http://schemas.microsoft.com/office/word/2020/wordml/sdtdatahash" xmlns:w16sdtfl="http://schemas.microsoft.com/office/word/2024/wordml/sdtformatlock" xmlns:w16se="http://schemas.microsoft.com/office/word/2015/wordml/symex" xmlns:wpg="http://schemas.microsoft.com/office/word/2010/wordprocessingGroup" xmlns:wpi="http://schemas.microsoft.com/office/word/2010/wordprocessingInk" xmlns:wne="http://schemas.microsoft.com/office/word/2006/wordml" xmlns:wps="http://schemas.microsoft.com/office/word/2010/wordprocessingShape" mc:Ignorable="w14 w15 w16se w16cid w16 w16cex w16sdtdh w16sdtfl w16du wp14">
+<w:ftr xmlns:wpc="http://schemas.microsoft.com/office/word/2010/wordprocessingCanvas" xmlns:cx="http://schemas.microsoft.com/office/drawing/2014/chartex" xmlns:cx1="http://schemas.microsoft.com/office/drawing/2015/9/8/chartex" xmlns:cx2="http://schemas.microsoft.com/office/drawing/2015/10/21/chartex" xmlns:cx3="http://schemas.microsoft.com/office/drawing/2016/5/9/chartex" xmlns:cx4="http://schemas.microsoft.com/office/drawing/2016/5/10/chartex" xmlns:cx5="http://schemas.microsoft.com/office/drawing/2016/5/11/chartex" xmlns:cx6="http://schemas.microsoft.com/office/drawing/2016/5/12/chartex" xmlns:cx7="http://schemas.microsoft.com/office/drawing/2016/5/13/chartex" xmlns:cx8="http://schemas.microsoft.com/office/drawing/2016/5/14/chartex" xmlns:mc="http://schemas.openxmlformats.org/markup-compatibility/2006" xmlns:aink="http://schemas.microsoft.com/office/drawing/2016/ink" xmlns:am3d="http://schemas.microsoft.com/office/drawing/2017/model3d" xmlns:o="urn:schemas-microsoft-com:office:office" xmlns:oel="http://schemas.microsoft.com/office/2019/extlst" xmlns:r="http://schemas.openxmlformats.org/officeDocument/2006/relationships" xmlns:m="http://schemas.openxmlformats.org/officeDocument/2006/math" xmlns:v="urn:schemas-microsoft-com:vml" xmlns:wp14="http://schemas.microsoft.com/office/word/2010/wordprocessingDrawing" xmlns:wp="http://schemas.openxmlformats.org/drawingml/2006/wordprocessingDrawing" xmlns:w10="urn:schemas-microsoft-com:office:word" xmlns:w="http://schemas.openxmlformats.org/wordprocessingml/2006/main" xmlns:w14="http://schemas.microsoft.com/office/word/2010/wordml" xmlns:w15="http://schemas.microsoft.com/office/word/2012/wordml" xmlns:w16cex="http://schemas.microsoft.com/office/word/2018/wordml/cex" xmlns:w16cid="http://schemas.microsoft.com/office/word/2016/wordml/cid" xmlns:w16="http://schemas.microsoft.com/office/word/2018/wordml" xmlns:w16du="http://schemas.microsoft.com/office/word/2023/wordml/word16du" xmlns:w16sdtdh="http://schemas.microsoft.com/office/word/2020/wordml/sdtdatahash" xmlns:w16sdtfl="http://schemas.microsoft.com/office/word/2024/wordml/sdtformatlock" xmlns:w16se="http://schemas.microsoft.com/office/word/2015/wordml/symex" xmlns:wpg="http://schemas.microsoft.com/office/word/2010/wordprocessingGroup" xmlns:wpi="http://schemas.microsoft.com/office/word/2010/wordprocessingInk" xmlns:wne="http://schemas.microsoft.com/office/word/2006/wordml" xmlns:wps="http://schemas.microsoft.com/office/word/2010/wordprocessingShape" mc:Ignorable="w14 w15 w16se w16cid w16 w16cex w16sdtdh w16sdtfl w16du wp14">
   <w:p>
     <w:pPr>
       <w:pStyle w:val="Footer"/>
@@ -1090,7 +1090,7 @@
 </file>
 
 <file path=word/footnotes.xml><?xml version="1.0" encoding="utf-8"?>
-<w:footnotes xmlns:wpc="http://schemas.microsoft.com/office/word/2010/wordprocessingCanvas" xmlns:cx="http://schemas.microsoft.com/office/drawing/2014/chartex" xmlns:cx1="http://schemas.microsoft.com/office/drawing/2015/9/8/chartex" xmlns:cx2="http://schemas.microsoft.com/office/drawing/2015/10/21/chartex" xmlns:cx3="http://schemas.microsoft.com/office/drawing/2016/5/9/chartex" xmlns:cx4="http://schemas.microsoft.com/office/drawing/2016/5/10/chartex" xmlns:cx5="http://schemas.microsoft.com/office/drawing/2016/5/11/chartex" xmlns:cx6="http://schemas.microsoft.com/office/drawing/2016/5/12/chartex" xmlns:cx7="http://schemas.microsoft.com/office/drawing/2016/5/13/chartex" xmlns:cx8="http://schemas.microsoft.com/office/drawing/2016/5/14/chartex" xmlns:mc="http://schemas.openxmlformats.org/markup-compatibility/2006" xmlns:aink="http://schemas.microsoft.com/office/drawing/2016/ink" xmlns:am3d="http://schemas.microsoft.com/office/drawing/2017/model3d" xmlns:o="urn:schemas-microsoft-com:office:office" xmlns:oel="http://schemas.microsoft.com/office/2019/extlst" xmlns:r="http://schemas.openxmlformats.org/officeDocument/2006/relationships" xmlns:m="http://schemas.openxmlformats.org/officeDocument/2006/math" xmlns:v="urn:schemas-microsoft-com:vml" xmlns:wp14="http://schemas.microsoft.com/office/word/2010/wordprocessingDrawing" xmlns:wp="http://schemas.openxmlformats.org/drawingml/2006/wordprocessingDrawing" xmlns:w10="urn:schemas-microsoft-com:office:word" xmlns:w="http://schemas.openxmlformats.org/wordprocessingml/2006/main" xmlns:w14="http://schemas.microsoft.com/office/word/2010/wordml" xmlns:w15="http://schemas.microsoft.com/office/word/2012/wordml" xmlns:w16cei="http://schemas.microsoft.com/office/word/2026/wordml/cei" xmlns:w16cex="http://schemas.microsoft.com/office/word/2018/wordml/cex" xmlns:w16cid="http://schemas.microsoft.com/office/word/2016/wordml/cid" xmlns:w16="http://schemas.microsoft.com/office/word/2018/wordml" xmlns:w16du="http://schemas.microsoft.com/office/word/2023/wordml/word16du" xmlns:w16sdtdh="http://schemas.microsoft.com/office/word/2020/wordml/sdtdatahash" xmlns:w16sdtfl="http://schemas.microsoft.com/office/word/2024/wordml/sdtformatlock" xmlns:w16se="http://schemas.microsoft.com/office/word/2015/wordml/symex" xmlns:wpg="http://schemas.microsoft.com/office/word/2010/wordprocessingGroup" xmlns:wpi="http://schemas.microsoft.com/office/word/2010/wordprocessingInk" xmlns:wne="http://schemas.microsoft.com/office/word/2006/wordml" xmlns:wps="http://schemas.microsoft.com/office/word/2010/wordprocessingShape" mc:Ignorable="w14 w15 w16se w16cid w16 w16cex w16sdtdh w16sdtfl w16du wp14">
+<w:footnotes xmlns:wpc="http://schemas.microsoft.com/office/word/2010/wordprocessingCanvas" xmlns:cx="http://schemas.microsoft.com/office/drawing/2014/chartex" xmlns:cx1="http://schemas.microsoft.com/office/drawing/2015/9/8/chartex" xmlns:cx2="http://schemas.microsoft.com/office/drawing/2015/10/21/chartex" xmlns:cx3="http://schemas.microsoft.com/office/drawing/2016/5/9/chartex" xmlns:cx4="http://schemas.microsoft.com/office/drawing/2016/5/10/chartex" xmlns:cx5="http://schemas.microsoft.com/office/drawing/2016/5/11/chartex" xmlns:cx6="http://schemas.microsoft.com/office/drawing/2016/5/12/chartex" xmlns:cx7="http://schemas.microsoft.com/office/drawing/2016/5/13/chartex" xmlns:cx8="http://schemas.microsoft.com/office/drawing/2016/5/14/chartex" xmlns:mc="http://schemas.openxmlformats.org/markup-compatibility/2006" xmlns:aink="http://schemas.microsoft.com/office/drawing/2016/ink" xmlns:am3d="http://schemas.microsoft.com/office/drawing/2017/model3d" xmlns:o="urn:schemas-microsoft-com:office:office" xmlns:oel="http://schemas.microsoft.com/office/2019/extlst" xmlns:r="http://schemas.openxmlformats.org/officeDocument/2006/relationships" xmlns:m="http://schemas.openxmlformats.org/officeDocument/2006/math" xmlns:v="urn:schemas-microsoft-com:vml" xmlns:wp14="http://schemas.microsoft.com/office/word/2010/wordprocessingDrawing" xmlns:wp="http://schemas.openxmlformats.org/drawingml/2006/wordprocessingDrawing" xmlns:w10="urn:schemas-microsoft-com:office:word" xmlns:w="http://schemas.openxmlformats.org/wordprocessingml/2006/main" xmlns:w14="http://schemas.microsoft.com/office/word/2010/wordml" xmlns:w15="http://schemas.microsoft.com/office/word/2012/wordml" xmlns:w16cex="http://schemas.microsoft.com/office/word/2018/wordml/cex" xmlns:w16cid="http://schemas.microsoft.com/office/word/2016/wordml/cid" xmlns:w16="http://schemas.microsoft.com/office/word/2018/wordml" xmlns:w16du="http://schemas.microsoft.com/office/word/2023/wordml/word16du" xmlns:w16sdtdh="http://schemas.microsoft.com/office/word/2020/wordml/sdtdatahash" xmlns:w16sdtfl="http://schemas.microsoft.com/office/word/2024/wordml/sdtformatlock" xmlns:w16se="http://schemas.microsoft.com/office/word/2015/wordml/symex" xmlns:wpg="http://schemas.microsoft.com/office/word/2010/wordprocessingGroup" xmlns:wpi="http://schemas.microsoft.com/office/word/2010/wordprocessingInk" xmlns:wne="http://schemas.microsoft.com/office/word/2006/wordml" xmlns:wps="http://schemas.microsoft.com/office/word/2010/wordprocessingShape" mc:Ignorable="w14 w15 w16se w16cid w16 w16cex w16sdtdh w16sdtfl w16du wp14">
   <w:footnote w:type="separator" w:id="-1">
     <w:p>
       <w:pPr>
@@ -1115,7 +1115,7 @@
 </file>
 
 <file path=word/header1.xml><?xml version="1.0" encoding="utf-8"?>
-<w:hdr xmlns:wpc="http://schemas.microsoft.com/office/word/2010/wordprocessingCanvas" xmlns:cx="http://schemas.microsoft.com/office/drawing/2014/chartex" xmlns:cx1="http://schemas.microsoft.com/office/drawing/2015/9/8/chartex" xmlns:cx2="http://schemas.microsoft.com/office/drawing/2015/10/21/chartex" xmlns:cx3="http://schemas.microsoft.com/office/drawing/2016/5/9/chartex" xmlns:cx4="http://schemas.microsoft.com/office/drawing/2016/5/10/chartex" xmlns:cx5="http://schemas.microsoft.com/office/drawing/2016/5/11/chartex" xmlns:cx6="http://schemas.microsoft.com/office/drawing/2016/5/12/chartex" xmlns:cx7="http://schemas.microsoft.com/office/drawing/2016/5/13/chartex" xmlns:cx8="http://schemas.microsoft.com/office/drawing/2016/5/14/chartex" xmlns:mc="http://schemas.openxmlformats.org/markup-compatibility/2006" xmlns:aink="http://schemas.microsoft.com/office/drawing/2016/ink" xmlns:am3d="http://schemas.microsoft.com/office/drawing/2017/model3d" xmlns:o="urn:schemas-microsoft-com:office:office" xmlns:oel="http://schemas.microsoft.com/office/2019/extlst" xmlns:r="http://schemas.openxmlformats.org/officeDocument/2006/relationships" xmlns:m="http://schemas.openxmlformats.org/officeDocument/2006/math" xmlns:v="urn:schemas-microsoft-com:vml" xmlns:wp14="http://schemas.microsoft.com/office/word/2010/wordprocessingDrawing" xmlns:wp="http://schemas.openxmlformats.org/drawingml/2006/wordprocessingDrawing" xmlns:w10="urn:schemas-microsoft-com:office:word" xmlns:w="http://schemas.openxmlformats.org/wordprocessingml/2006/main" xmlns:w14="http://schemas.microsoft.com/office/word/2010/wordml" xmlns:w15="http://schemas.microsoft.com/office/word/2012/wordml" xmlns:w16cei="http://schemas.microsoft.com/office/word/2026/wordml/cei" xmlns:w16cex="http://schemas.microsoft.com/office/word/2018/wordml/cex" xmlns:w16cid="http://schemas.microsoft.com/office/word/2016/wordml/cid" xmlns:w16="http://schemas.microsoft.com/office/word/2018/wordml" xmlns:w16du="http://schemas.microsoft.com/office/word/2023/wordml/word16du" xmlns:w16sdtdh="http://schemas.microsoft.com/office/word/2020/wordml/sdtdatahash" xmlns:w16sdtfl="http://schemas.microsoft.com/office/word/2024/wordml/sdtformatlock" xmlns:w16se="http://schemas.microsoft.com/office/word/2015/wordml/symex" xmlns:wpg="http://schemas.microsoft.com/office/word/2010/wordprocessingGroup" xmlns:wpi="http://schemas.microsoft.com/office/word/2010/wordprocessingInk" xmlns:wne="http://schemas.microsoft.com/office/word/2006/wordml" xmlns:wps="http://schemas.microsoft.com/office/word/2010/wordprocessingShape" mc:Ignorable="w14 w15 w16se w16cid w16 w16cex w16sdtdh w16sdtfl w16du wp14">
+<w:hdr xmlns:wpc="http://schemas.microsoft.com/office/word/2010/wordprocessingCanvas" xmlns:cx="http://schemas.microsoft.com/office/drawing/2014/chartex" xmlns:cx1="http://schemas.microsoft.com/office/drawing/2015/9/8/chartex" xmlns:cx2="http://schemas.microsoft.com/office/drawing/2015/10/21/chartex" xmlns:cx3="http://schemas.microsoft.com/office/drawing/2016/5/9/chartex" xmlns:cx4="http://schemas.microsoft.com/office/drawing/2016/5/10/chartex" xmlns:cx5="http://schemas.microsoft.com/office/drawing/2016/5/11/chartex" xmlns:cx6="http://schemas.microsoft.com/office/drawing/2016/5/12/chartex" xmlns:cx7="http://schemas.microsoft.com/office/drawing/2016/5/13/chartex" xmlns:cx8="http://schemas.microsoft.com/office/drawing/2016/5/14/chartex" xmlns:mc="http://schemas.openxmlformats.org/markup-compatibility/2006" xmlns:aink="http://schemas.microsoft.com/office/drawing/2016/ink" xmlns:am3d="http://schemas.microsoft.com/office/drawing/2017/model3d" xmlns:o="urn:schemas-microsoft-com:office:office" xmlns:oel="http://schemas.microsoft.com/office/2019/extlst" xmlns:r="http://schemas.openxmlformats.org/officeDocument/2006/relationships" xmlns:m="http://schemas.openxmlformats.org/officeDocument/2006/math" xmlns:v="urn:schemas-microsoft-com:vml" xmlns:wp14="http://schemas.microsoft.com/office/word/2010/wordprocessingDrawing" xmlns:wp="http://schemas.openxmlformats.org/drawingml/2006/wordprocessingDrawing" xmlns:w10="urn:schemas-microsoft-com:office:word" xmlns:w="http://schemas.openxmlformats.org/wordprocessingml/2006/main" xmlns:w14="http://schemas.microsoft.com/office/word/2010/wordml" xmlns:w15="http://schemas.microsoft.com/office/word/2012/wordml" xmlns:w16cex="http://schemas.microsoft.com/office/word/2018/wordml/cex" xmlns:w16cid="http://schemas.microsoft.com/office/word/2016/wordml/cid" xmlns:w16="http://schemas.microsoft.com/office/word/2018/wordml" xmlns:w16du="http://schemas.microsoft.com/office/word/2023/wordml/word16du" xmlns:w16sdtdh="http://schemas.microsoft.com/office/word/2020/wordml/sdtdatahash" xmlns:w16sdtfl="http://schemas.microsoft.com/office/word/2024/wordml/sdtformatlock" xmlns:w16se="http://schemas.microsoft.com/office/word/2015/wordml/symex" xmlns:wpg="http://schemas.microsoft.com/office/word/2010/wordprocessingGroup" xmlns:wpi="http://schemas.microsoft.com/office/word/2010/wordprocessingInk" xmlns:wne="http://schemas.microsoft.com/office/word/2006/wordml" xmlns:wps="http://schemas.microsoft.com/office/word/2010/wordprocessingShape" mc:Ignorable="w14 w15 w16se w16cid w16 w16cex w16sdtdh w16sdtfl w16du wp14">
   <w:p>
     <w:pPr>
       <w:pStyle w:val="Header"/>
@@ -1125,7 +1125,7 @@
 </file>
 
 <file path=word/header2.xml><?xml version="1.0" encoding="utf-8"?>
-<w:hdr xmlns:wpc="http://schemas.microsoft.com/office/word/2010/wordprocessingCanvas" xmlns:cx="http://schemas.microsoft.com/office/drawing/2014/chartex" xmlns:cx1="http://schemas.microsoft.com/office/drawing/2015/9/8/chartex" xmlns:cx2="http://schemas.microsoft.com/office/drawing/2015/10/21/chartex" xmlns:cx3="http://schemas.microsoft.com/office/drawing/2016/5/9/chartex" xmlns:cx4="http://schemas.microsoft.com/office/drawing/2016/5/10/chartex" xmlns:cx5="http://schemas.microsoft.com/office/drawing/2016/5/11/chartex" xmlns:cx6="http://schemas.microsoft.com/office/drawing/2016/5/12/chartex" xmlns:cx7="http://schemas.microsoft.com/office/drawing/2016/5/13/chartex" xmlns:cx8="http://schemas.microsoft.com/office/drawing/2016/5/14/chartex" xmlns:mc="http://schemas.openxmlformats.org/markup-compatibility/2006" xmlns:aink="http://schemas.microsoft.com/office/drawing/2016/ink" xmlns:am3d="http://schemas.microsoft.com/office/drawing/2017/model3d" xmlns:o="urn:schemas-microsoft-com:office:office" xmlns:oel="http://schemas.microsoft.com/office/2019/extlst" xmlns:r="http://schemas.openxmlformats.org/officeDocument/2006/relationships" xmlns:m="http://schemas.openxmlformats.org/officeDocument/2006/math" xmlns:v="urn:schemas-microsoft-com:vml" xmlns:wp14="http://schemas.microsoft.com/office/word/2010/wordprocessingDrawing" xmlns:wp="http://schemas.openxmlformats.org/drawingml/2006/wordprocessingDrawing" xmlns:w10="urn:schemas-microsoft-com:office:word" xmlns:w="http://schemas.openxmlformats.org/wordprocessingml/2006/main" xmlns:w14="http://schemas.microsoft.com/office/word/2010/wordml" xmlns:w15="http://schemas.microsoft.com/office/word/2012/wordml" xmlns:w16cei="http://schemas.microsoft.com/office/word/2026/wordml/cei" xmlns:w16cex="http://schemas.microsoft.com/office/word/2018/wordml/cex" xmlns:w16cid="http://schemas.microsoft.com/office/word/2016/wordml/cid" xmlns:w16="http://schemas.microsoft.com/office/word/2018/wordml" xmlns:w16du="http://schemas.microsoft.com/office/word/2023/wordml/word16du" xmlns:w16sdtdh="http://schemas.microsoft.com/office/word/2020/wordml/sdtdatahash" xmlns:w16sdtfl="http://schemas.microsoft.com/office/word/2024/wordml/sdtformatlock" xmlns:w16se="http://schemas.microsoft.com/office/word/2015/wordml/symex" xmlns:wpg="http://schemas.microsoft.com/office/word/2010/wordprocessingGroup" xmlns:wpi="http://schemas.microsoft.com/office/word/2010/wordprocessingInk" xmlns:wne="http://schemas.microsoft.com/office/word/2006/wordml" xmlns:wps="http://schemas.microsoft.com/office/word/2010/wordprocessingShape" mc:Ignorable="w14 w15 w16se w16cid w16 w16cex w16sdtdh w16sdtfl w16du wp14">
+<w:hdr xmlns:wpc="http://schemas.microsoft.com/office/word/2010/wordprocessingCanvas" xmlns:cx="http://schemas.microsoft.com/office/drawing/2014/chartex" xmlns:cx1="http://schemas.microsoft.com/office/drawing/2015/9/8/chartex" xmlns:cx2="http://schemas.microsoft.com/office/drawing/2015/10/21/chartex" xmlns:cx3="http://schemas.microsoft.com/office/drawing/2016/5/9/chartex" xmlns:cx4="http://schemas.microsoft.com/office/drawing/2016/5/10/chartex" xmlns:cx5="http://schemas.microsoft.com/office/drawing/2016/5/11/chartex" xmlns:cx6="http://schemas.microsoft.com/office/drawing/2016/5/12/chartex" xmlns:cx7="http://schemas.microsoft.com/office/drawing/2016/5/13/chartex" xmlns:cx8="http://schemas.microsoft.com/office/drawing/2016/5/14/chartex" xmlns:mc="http://schemas.openxmlformats.org/markup-compatibility/2006" xmlns:aink="http://schemas.microsoft.com/office/drawing/2016/ink" xmlns:am3d="http://schemas.microsoft.com/office/drawing/2017/model3d" xmlns:o="urn:schemas-microsoft-com:office:office" xmlns:oel="http://schemas.microsoft.com/office/2019/extlst" xmlns:r="http://schemas.openxmlformats.org/officeDocument/2006/relationships" xmlns:m="http://schemas.openxmlformats.org/officeDocument/2006/math" xmlns:v="urn:schemas-microsoft-com:vml" xmlns:wp14="http://schemas.microsoft.com/office/word/2010/wordprocessingDrawing" xmlns:wp="http://schemas.openxmlformats.org/drawingml/2006/wordprocessingDrawing" xmlns:w10="urn:schemas-microsoft-com:office:word" xmlns:w="http://schemas.openxmlformats.org/wordprocessingml/2006/main" xmlns:w14="http://schemas.microsoft.com/office/word/2010/wordml" xmlns:w15="http://schemas.microsoft.com/office/word/2012/wordml" xmlns:w16cex="http://schemas.microsoft.com/office/word/2018/wordml/cex" xmlns:w16cid="http://schemas.microsoft.com/office/word/2016/wordml/cid" xmlns:w16="http://schemas.microsoft.com/office/word/2018/wordml" xmlns:w16du="http://schemas.microsoft.com/office/word/2023/wordml/word16du" xmlns:w16sdtdh="http://schemas.microsoft.com/office/word/2020/wordml/sdtdatahash" xmlns:w16sdtfl="http://schemas.microsoft.com/office/word/2024/wordml/sdtformatlock" xmlns:w16se="http://schemas.microsoft.com/office/word/2015/wordml/symex" xmlns:wpg="http://schemas.microsoft.com/office/word/2010/wordprocessingGroup" xmlns:wpi="http://schemas.microsoft.com/office/word/2010/wordprocessingInk" xmlns:wne="http://schemas.microsoft.com/office/word/2006/wordml" xmlns:wps="http://schemas.microsoft.com/office/word/2010/wordprocessingShape" mc:Ignorable="w14 w15 w16se w16cid w16 w16cex w16sdtdh w16sdtfl w16du wp14">
   <w:p>
     <w:pPr>
       <w:pStyle w:val="Header"/>
@@ -1135,7 +1135,7 @@
 </file>
 
 <file path=word/header3.xml><?xml version="1.0" encoding="utf-8"?>
-<w:hdr xmlns:wpc="http://schemas.microsoft.com/office/word/2010/wordprocessingCanvas" xmlns:cx="http://schemas.microsoft.com/office/drawing/2014/chartex" xmlns:cx1="http://schemas.microsoft.com/office/drawing/2015/9/8/chartex" xmlns:cx2="http://schemas.microsoft.com/office/drawing/2015/10/21/chartex" xmlns:cx3="http://schemas.microsoft.com/office/drawing/2016/5/9/chartex" xmlns:cx4="http://schemas.microsoft.com/office/drawing/2016/5/10/chartex" xmlns:cx5="http://schemas.microsoft.com/office/drawing/2016/5/11/chartex" xmlns:cx6="http://schemas.microsoft.com/office/drawing/2016/5/12/chartex" xmlns:cx7="http://schemas.microsoft.com/office/drawing/2016/5/13/chartex" xmlns:cx8="http://schemas.microsoft.com/office/drawing/2016/5/14/chartex" xmlns:mc="http://schemas.openxmlformats.org/markup-compatibility/2006" xmlns:aink="http://schemas.microsoft.com/office/drawing/2016/ink" xmlns:am3d="http://schemas.microsoft.com/office/drawing/2017/model3d" xmlns:o="urn:schemas-microsoft-com:office:office" xmlns:oel="http://schemas.microsoft.com/office/2019/extlst" xmlns:r="http://schemas.openxmlformats.org/officeDocument/2006/relationships" xmlns:m="http://schemas.openxmlformats.org/officeDocument/2006/math" xmlns:v="urn:schemas-microsoft-com:vml" xmlns:wp14="http://schemas.microsoft.com/office/word/2010/wordprocessingDrawing" xmlns:wp="http://schemas.openxmlformats.org/drawingml/2006/wordprocessingDrawing" xmlns:w10="urn:schemas-microsoft-com:office:word" xmlns:w="http://schemas.openxmlformats.org/wordprocessingml/2006/main" xmlns:w14="http://schemas.microsoft.com/office/word/2010/wordml" xmlns:w15="http://schemas.microsoft.com/office/word/2012/wordml" xmlns:w16cei="http://schemas.microsoft.com/office/word/2026/wordml/cei" xmlns:w16cex="http://schemas.microsoft.com/office/word/2018/wordml/cex" xmlns:w16cid="http://schemas.microsoft.com/office/word/2016/wordml/cid" xmlns:w16="http://schemas.microsoft.com/office/word/2018/wordml" xmlns:w16du="http://schemas.microsoft.com/office/word/2023/wordml/word16du" xmlns:w16sdtdh="http://schemas.microsoft.com/office/word/2020/wordml/sdtdatahash" xmlns:w16sdtfl="http://schemas.microsoft.com/office/word/2024/wordml/sdtformatlock" xmlns:w16se="http://schemas.microsoft.com/office/word/2015/wordml/symex" xmlns:wpg="http://schemas.microsoft.com/office/word/2010/wordprocessingGroup" xmlns:wpi="http://schemas.microsoft.com/office/word/2010/wordprocessingInk" xmlns:wne="http://schemas.microsoft.com/office/word/2006/wordml" xmlns:wps="http://schemas.microsoft.com/office/word/2010/wordprocessingShape" mc:Ignorable="w14 w15 w16se w16cid w16 w16cex w16sdtdh w16sdtfl w16du wp14">
+<w:hdr xmlns:wpc="http://schemas.microsoft.com/office/word/2010/wordprocessingCanvas" xmlns:cx="http://schemas.microsoft.com/office/drawing/2014/chartex" xmlns:cx1="http://schemas.microsoft.com/office/drawing/2015/9/8/chartex" xmlns:cx2="http://schemas.microsoft.com/office/drawing/2015/10/21/chartex" xmlns:cx3="http://schemas.microsoft.com/office/drawing/2016/5/9/chartex" xmlns:cx4="http://schemas.microsoft.com/office/drawing/2016/5/10/chartex" xmlns:cx5="http://schemas.microsoft.com/office/drawing/2016/5/11/chartex" xmlns:cx6="http://schemas.microsoft.com/office/drawing/2016/5/12/chartex" xmlns:cx7="http://schemas.microsoft.com/office/drawing/2016/5/13/chartex" xmlns:cx8="http://schemas.microsoft.com/office/drawing/2016/5/14/chartex" xmlns:mc="http://schemas.openxmlformats.org/markup-compatibility/2006" xmlns:aink="http://schemas.microsoft.com/office/drawing/2016/ink" xmlns:am3d="http://schemas.microsoft.com/office/drawing/2017/model3d" xmlns:o="urn:schemas-microsoft-com:office:office" xmlns:oel="http://schemas.microsoft.com/office/2019/extlst" xmlns:r="http://schemas.openxmlformats.org/officeDocument/2006/relationships" xmlns:m="http://schemas.openxmlformats.org/officeDocument/2006/math" xmlns:v="urn:schemas-microsoft-com:vml" xmlns:wp14="http://schemas.microsoft.com/office/word/2010/wordprocessingDrawing" xmlns:wp="http://schemas.openxmlformats.org/drawingml/2006/wordprocessingDrawing" xmlns:w10="urn:schemas-microsoft-com:office:word" xmlns:w="http://schemas.openxmlformats.org/wordprocessingml/2006/main" xmlns:w14="http://schemas.microsoft.com/office/word/2010/wordml" xmlns:w15="http://schemas.microsoft.com/office/word/2012/wordml" xmlns:w16cex="http://schemas.microsoft.com/office/word/2018/wordml/cex" xmlns:w16cid="http://schemas.microsoft.com/office/word/2016/wordml/cid" xmlns:w16="http://schemas.microsoft.com/office/word/2018/wordml" xmlns:w16du="http://schemas.microsoft.com/office/word/2023/wordml/word16du" xmlns:w16sdtdh="http://schemas.microsoft.com/office/word/2020/wordml/sdtdatahash" xmlns:w16sdtfl="http://schemas.microsoft.com/office/word/2024/wordml/sdtformatlock" xmlns:w16se="http://schemas.microsoft.com/office/word/2015/wordml/symex" xmlns:wpg="http://schemas.microsoft.com/office/word/2010/wordprocessingGroup" xmlns:wpi="http://schemas.microsoft.com/office/word/2010/wordprocessingInk" xmlns:wne="http://schemas.microsoft.com/office/word/2006/wordml" xmlns:wps="http://schemas.microsoft.com/office/word/2010/wordprocessingShape" mc:Ignorable="w14 w15 w16se w16cid w16 w16cex w16sdtdh w16sdtfl w16du wp14">
   <w:p>
     <w:pPr>
       <w:pStyle w:val="Header"/>
@@ -1327,7 +1327,7 @@
 </file>
 
 <file path=word/numbering.xml><?xml version="1.0" encoding="utf-8"?>
-<w:numbering xmlns:wpc="http://schemas.microsoft.com/office/word/2010/wordprocessingCanvas" xmlns:cx="http://schemas.microsoft.com/office/drawing/2014/chartex" xmlns:cx1="http://schemas.microsoft.com/office/drawing/2015/9/8/chartex" xmlns:cx2="http://schemas.microsoft.com/office/drawing/2015/10/21/chartex" xmlns:cx3="http://schemas.microsoft.com/office/drawing/2016/5/9/chartex" xmlns:cx4="http://schemas.microsoft.com/office/drawing/2016/5/10/chartex" xmlns:cx5="http://schemas.microsoft.com/office/drawing/2016/5/11/chartex" xmlns:cx6="http://schemas.microsoft.com/office/drawing/2016/5/12/chartex" xmlns:cx7="http://schemas.microsoft.com/office/drawing/2016/5/13/chartex" xmlns:cx8="http://schemas.microsoft.com/office/drawing/2016/5/14/chartex" xmlns:mc="http://schemas.openxmlformats.org/markup-compatibility/2006" xmlns:aink="http://schemas.microsoft.com/office/drawing/2016/ink" xmlns:am3d="http://schemas.microsoft.com/office/drawing/2017/model3d" xmlns:o="urn:schemas-microsoft-com:office:office" xmlns:oel="http://schemas.microsoft.com/office/2019/extlst" xmlns:r="http://schemas.openxmlformats.org/officeDocument/2006/relationships" xmlns:m="http://schemas.openxmlformats.org/officeDocument/2006/math" xmlns:v="urn:schemas-microsoft-com:vml" xmlns:wp14="http://schemas.microsoft.com/office/word/2010/wordprocessingDrawing" xmlns:wp="http://schemas.openxmlformats.org/drawingml/2006/wordprocessingDrawing" xmlns:w10="urn:schemas-microsoft-com:office:word" xmlns:w="http://schemas.openxmlformats.org/wordprocessingml/2006/main" xmlns:w14="http://schemas.microsoft.com/office/word/2010/wordml" xmlns:w15="http://schemas.microsoft.com/office/word/2012/wordml" xmlns:w16cei="http://schemas.microsoft.com/office/word/2026/wordml/cei" xmlns:w16cex="http://schemas.microsoft.com/office/word/2018/wordml/cex" xmlns:w16cid="http://schemas.microsoft.com/office/word/2016/wordml/cid" xmlns:w16="http://schemas.microsoft.com/office/word/2018/wordml" xmlns:w16du="http://schemas.microsoft.com/office/word/2023/wordml/word16du" xmlns:w16sdtdh="http://schemas.microsoft.com/office/word/2020/wordml/sdtdatahash" xmlns:w16sdtfl="http://schemas.microsoft.com/office/word/2024/wordml/sdtformatlock" xmlns:w16se="http://schemas.microsoft.com/office/word/2015/wordml/symex" xmlns:wpg="http://schemas.microsoft.com/office/word/2010/wordprocessingGroup" xmlns:wpi="http://schemas.microsoft.com/office/word/2010/wordprocessingInk" xmlns:wne="http://schemas.microsoft.com/office/word/2006/wordml" xmlns:wps="http://schemas.microsoft.com/office/word/2010/wordprocessingShape" mc:Ignorable="w14 w15 w16se w16cid w16 w16cex w16sdtdh w16sdtfl w16du wp14">
+<w:numbering xmlns:wpc="http://schemas.microsoft.com/office/word/2010/wordprocessingCanvas" xmlns:cx="http://schemas.microsoft.com/office/drawing/2014/chartex" xmlns:cx1="http://schemas.microsoft.com/office/drawing/2015/9/8/chartex" xmlns:cx2="http://schemas.microsoft.com/office/drawing/2015/10/21/chartex" xmlns:cx3="http://schemas.microsoft.com/office/drawing/2016/5/9/chartex" xmlns:cx4="http://schemas.microsoft.com/office/drawing/2016/5/10/chartex" xmlns:cx5="http://schemas.microsoft.com/office/drawing/2016/5/11/chartex" xmlns:cx6="http://schemas.microsoft.com/office/drawing/2016/5/12/chartex" xmlns:cx7="http://schemas.microsoft.com/office/drawing/2016/5/13/chartex" xmlns:cx8="http://schemas.microsoft.com/office/drawing/2016/5/14/chartex" xmlns:mc="http://schemas.openxmlformats.org/markup-compatibility/2006" xmlns:aink="http://schemas.microsoft.com/office/drawing/2016/ink" xmlns:am3d="http://schemas.microsoft.com/office/drawing/2017/model3d" xmlns:o="urn:schemas-microsoft-com:office:office" xmlns:oel="http://schemas.microsoft.com/office/2019/extlst" xmlns:r="http://schemas.openxmlformats.org/officeDocument/2006/relationships" xmlns:m="http://schemas.openxmlformats.org/officeDocument/2006/math" xmlns:v="urn:schemas-microsoft-com:vml" xmlns:wp14="http://schemas.microsoft.com/office/word/2010/wordprocessingDrawing" xmlns:wp="http://schemas.openxmlformats.org/drawingml/2006/wordprocessingDrawing" xmlns:w10="urn:schemas-microsoft-com:office:word" xmlns:w="http://schemas.openxmlformats.org/wordprocessingml/2006/main" xmlns:w14="http://schemas.microsoft.com/office/word/2010/wordml" xmlns:w15="http://schemas.microsoft.com/office/word/2012/wordml" xmlns:w16cex="http://schemas.microsoft.com/office/word/2018/wordml/cex" xmlns:w16cid="http://schemas.microsoft.com/office/word/2016/wordml/cid" xmlns:w16="http://schemas.microsoft.com/office/word/2018/wordml" xmlns:w16du="http://schemas.microsoft.com/office/word/2023/wordml/word16du" xmlns:w16sdtdh="http://schemas.microsoft.com/office/word/2020/wordml/sdtdatahash" xmlns:w16sdtfl="http://schemas.microsoft.com/office/word/2024/wordml/sdtformatlock" xmlns:w16se="http://schemas.microsoft.com/office/word/2015/wordml/symex" xmlns:wpg="http://schemas.microsoft.com/office/word/2010/wordprocessingGroup" xmlns:wpi="http://schemas.microsoft.com/office/word/2010/wordprocessingInk" xmlns:wne="http://schemas.microsoft.com/office/word/2006/wordml" xmlns:wps="http://schemas.microsoft.com/office/word/2010/wordprocessingShape" mc:Ignorable="w14 w15 w16se w16cid w16 w16cex w16sdtdh w16sdtfl w16du wp14">
   <w:abstractNum w:abstractNumId="0" w15:restartNumberingAfterBreak="0">
     <w:nsid w:val="10891A84"/>
     <w:multiLevelType w:val="hybridMultilevel"/>

</xml_diff>